<commit_message>
feat: track requirement editing time
</commit_message>
<xml_diff>
--- a/apps/api/templates/test-requirements-review-report-v2.docx
+++ b/apps/api/templates/test-requirements-review-report-v2.docx
@@ -74,8 +74,6 @@
         </w:rPr>
         <w:t>针对测试需求智能生成结果开展质量评估，通过与原始需求规格说明、接口文档及测试需求编写规范进行对比分析，从正确性、覆盖性、可测试性等方面评价生成结果质量。</w:t>
       </w:r>
-      <w:bookmarkStart w:id="0" w:name="_GoBack"/>
-      <w:bookmarkEnd w:id="0"/>
     </w:p>
     <w:p>
       <w:pPr>
@@ -4379,6 +4377,218 @@
           <w:szCs w:val="24"/>
         </w:rPr>
       </w:pPr>
+    </w:p>
+    <w:p>
+      <w:pPr>
+        <w:pStyle w:val="3"/>
+      </w:pPr>
+      <w:r>
+        <w:rPr>
+          <w:rFonts w:hint="eastAsia" w:eastAsia="宋体"/>
+          <w:b/>
+          <w:sz w:val="28"/>
+          <w:lang w:val="en-US" w:eastAsia="zh-CN"/>
+        </w:rPr>
+        <w:t xml:space="preserve">5 </w:t>
+      </w:r>
+      <w:r>
+        <w:rPr>
+          <w:rFonts w:ascii="Times New Roman" w:hAnsi="Times New Roman" w:eastAsia="黑体" w:cs="Times New Roman"/>
+          <w:b w:val="0"/>
+          <w:bCs w:val="0"/>
+          <w:sz w:val="32"/>
+          <w:szCs w:val="44"/>
+        </w:rPr>
+        <w:t>人工编辑用时</w:t>
+      </w:r>
+      <w:bookmarkStart w:id="0" w:name="_GoBack"/>
+      <w:bookmarkEnd w:id="0"/>
+    </w:p>
+    <w:tbl>
+      <w:tblPr>
+        <w:tblStyle w:val="33"/>
+        <w:tblW w:w="0" w:type="auto"/>
+        <w:tblInd w:w="0" w:type="dxa"/>
+        <w:tblBorders>
+          <w:top w:val="single" w:color="auto" w:sz="4" w:space="0"/>
+          <w:left w:val="single" w:color="auto" w:sz="4" w:space="0"/>
+          <w:bottom w:val="single" w:color="auto" w:sz="4" w:space="0"/>
+          <w:right w:val="single" w:color="auto" w:sz="4" w:space="0"/>
+          <w:insideH w:val="single" w:color="auto" w:sz="4" w:space="0"/>
+          <w:insideV w:val="single" w:color="auto" w:sz="4" w:space="0"/>
+        </w:tblBorders>
+        <w:tblLayout w:type="fixed"/>
+        <w:tblCellMar>
+          <w:top w:w="0" w:type="dxa"/>
+          <w:left w:w="108" w:type="dxa"/>
+          <w:bottom w:w="0" w:type="dxa"/>
+          <w:right w:w="108" w:type="dxa"/>
+        </w:tblCellMar>
+      </w:tblPr>
+      <w:tblGrid>
+        <w:gridCol w:w="2880"/>
+        <w:gridCol w:w="2880"/>
+        <w:gridCol w:w="2880"/>
+      </w:tblGrid>
+      <w:tr>
+        <w:tblPrEx>
+          <w:tblBorders>
+            <w:top w:val="single" w:color="auto" w:sz="4" w:space="0"/>
+            <w:left w:val="single" w:color="auto" w:sz="4" w:space="0"/>
+            <w:bottom w:val="single" w:color="auto" w:sz="4" w:space="0"/>
+            <w:right w:val="single" w:color="auto" w:sz="4" w:space="0"/>
+            <w:insideH w:val="single" w:color="auto" w:sz="4" w:space="0"/>
+            <w:insideV w:val="single" w:color="auto" w:sz="4" w:space="0"/>
+          </w:tblBorders>
+          <w:tblCellMar>
+            <w:top w:w="0" w:type="dxa"/>
+            <w:left w:w="108" w:type="dxa"/>
+            <w:bottom w:w="0" w:type="dxa"/>
+            <w:right w:w="108" w:type="dxa"/>
+          </w:tblCellMar>
+        </w:tblPrEx>
+        <w:tc>
+          <w:tcPr>
+            <w:tcW w:w="1020" w:type="dxa"/>
+            <w:vAlign w:val="center"/>
+          </w:tcPr>
+          <w:p>
+            <w:pPr>
+              <w:jc w:val="center"/>
+            </w:pPr>
+            <w:r>
+              <w:rPr>
+                <w:rFonts w:ascii="宋体" w:hAnsi="宋体" w:eastAsia="宋体"/>
+                <w:b/>
+                <w:sz w:val="21"/>
+              </w:rPr>
+              <w:t>序号</w:t>
+            </w:r>
+          </w:p>
+        </w:tc>
+        <w:tc>
+          <w:tcPr>
+            <w:tcW w:w="4082" w:type="dxa"/>
+            <w:vAlign w:val="center"/>
+          </w:tcPr>
+          <w:p>
+            <w:pPr>
+              <w:jc w:val="center"/>
+            </w:pPr>
+            <w:r>
+              <w:rPr>
+                <w:rFonts w:ascii="宋体" w:hAnsi="宋体" w:eastAsia="宋体"/>
+                <w:b/>
+                <w:sz w:val="21"/>
+              </w:rPr>
+              <w:t>编辑用户</w:t>
+            </w:r>
+          </w:p>
+        </w:tc>
+        <w:tc>
+          <w:tcPr>
+            <w:tcW w:w="3402" w:type="dxa"/>
+            <w:vAlign w:val="center"/>
+          </w:tcPr>
+          <w:p>
+            <w:pPr>
+              <w:jc w:val="center"/>
+            </w:pPr>
+            <w:r>
+              <w:rPr>
+                <w:rFonts w:ascii="宋体" w:hAnsi="宋体" w:eastAsia="宋体"/>
+                <w:b/>
+                <w:sz w:val="21"/>
+              </w:rPr>
+              <w:t>累计编辑用时</w:t>
+            </w:r>
+          </w:p>
+        </w:tc>
+      </w:tr>
+      <w:tr>
+        <w:tblPrEx>
+          <w:tblBorders>
+            <w:top w:val="single" w:color="auto" w:sz="4" w:space="0"/>
+            <w:left w:val="single" w:color="auto" w:sz="4" w:space="0"/>
+            <w:bottom w:val="single" w:color="auto" w:sz="4" w:space="0"/>
+            <w:right w:val="single" w:color="auto" w:sz="4" w:space="0"/>
+            <w:insideH w:val="single" w:color="auto" w:sz="4" w:space="0"/>
+            <w:insideV w:val="single" w:color="auto" w:sz="4" w:space="0"/>
+          </w:tblBorders>
+          <w:tblCellMar>
+            <w:top w:w="0" w:type="dxa"/>
+            <w:left w:w="108" w:type="dxa"/>
+            <w:bottom w:w="0" w:type="dxa"/>
+            <w:right w:w="108" w:type="dxa"/>
+          </w:tblCellMar>
+        </w:tblPrEx>
+        <w:tc>
+          <w:tcPr>
+            <w:tcW w:w="1020" w:type="dxa"/>
+            <w:vAlign w:val="center"/>
+          </w:tcPr>
+          <w:p>
+            <w:pPr>
+              <w:jc w:val="center"/>
+            </w:pPr>
+            <w:r>
+              <w:rPr>
+                <w:rFonts w:ascii="宋体" w:hAnsi="宋体" w:eastAsia="宋体"/>
+                <w:sz w:val="21"/>
+              </w:rPr>
+              <w:t>{#editTimeRows}{seq}</w:t>
+            </w:r>
+          </w:p>
+        </w:tc>
+        <w:tc>
+          <w:tcPr>
+            <w:tcW w:w="4082" w:type="dxa"/>
+            <w:vAlign w:val="center"/>
+          </w:tcPr>
+          <w:p>
+            <w:pPr>
+              <w:jc w:val="center"/>
+            </w:pPr>
+            <w:r>
+              <w:rPr>
+                <w:rFonts w:ascii="宋体" w:hAnsi="宋体" w:eastAsia="宋体"/>
+                <w:sz w:val="21"/>
+              </w:rPr>
+              <w:t>{username}</w:t>
+            </w:r>
+          </w:p>
+        </w:tc>
+        <w:tc>
+          <w:tcPr>
+            <w:tcW w:w="3402" w:type="dxa"/>
+            <w:vAlign w:val="center"/>
+          </w:tcPr>
+          <w:p>
+            <w:pPr>
+              <w:jc w:val="center"/>
+            </w:pPr>
+            <w:r>
+              <w:rPr>
+                <w:rFonts w:ascii="宋体" w:hAnsi="宋体" w:eastAsia="宋体"/>
+                <w:sz w:val="21"/>
+              </w:rPr>
+              <w:t>{duration}{/editTimeRows}</w:t>
+            </w:r>
+          </w:p>
+        </w:tc>
+      </w:tr>
+    </w:tbl>
+    <w:p>
+      <w:pPr>
+        <w:jc w:val="right"/>
+      </w:pPr>
+      <w:r>
+        <w:rPr>
+          <w:rFonts w:ascii="宋体" w:hAnsi="宋体" w:eastAsia="宋体"/>
+          <w:sz w:val="21"/>
+        </w:rPr>
+        <w:t>项目总编辑用时：{projectEditDuration}</w:t>
+      </w:r>
     </w:p>
     <w:sectPr>
       <w:pgSz w:w="12240" w:h="15840"/>

</xml_diff>